<commit_message>
fix: preserve native combination diagnostic identities and close T2-14 review
</commit_message>
<xml_diff>
--- a/docs/evidence/plan2/T2-14/native-combination.docx
+++ b/docs/evidence/plan2/T2-14/native-combination.docx
@@ -33,7 +33,7 @@
         <w:spacing w:after="130"/>
       </w:pPr>
       <w:r>
-        <w:t xml:space="preserve">项目 T31 combination-negative；项目 ID project_25236a05-cd5d-4c42-959c-028292d31d99</w:t>
+        <w:t xml:space="preserve">项目 T31 combination-negative；项目 ID project_9a88c3f9-cbbe-4e61-a7aa-f0a75dcd7392</w:t>
       </w:r>
     </w:p>
     <w:p>
@@ -41,7 +41,7 @@
         <w:spacing w:after="130"/>
       </w:pPr>
       <w:r>
-        <w:t xml:space="preserve">分析 ID analysis_3d5541c3-1998-4796-b283-9192a884ea55；输入修订 R12；状态 已完成</w:t>
+        <w:t xml:space="preserve">分析 ID analysis_719768b7-baec-471c-ab94-7d9f31dc3c98；输入修订 R12；状态 已完成</w:t>
       </w:r>
     </w:p>
     <w:p>
@@ -49,7 +49,7 @@
         <w:spacing w:after="130"/>
       </w:pPr>
       <w:r>
-        <w:t xml:space="preserve">分析时间 2026-10-05T08:47:43Z；报告生成时间 2026-10-05T08:47:43.942Z（ISO 8601）</w:t>
+        <w:t xml:space="preserve">分析时间 2026-10-05T09:05:18Z；报告生成时间 2026-10-05T09:05:19.174Z（ISO 8601）</w:t>
       </w:r>
     </w:p>
     <w:p>
@@ -57,7 +57,7 @@
         <w:spacing w:after="130"/>
       </w:pPr>
       <w:r>
-        <w:t xml:space="preserve">运行来源 formal-model；请求 request_599a1712-a0cf-4315-860e-6c5ac09ebe92；实际阶段 模型检查 (2026-10-05T08:47:43Z) → 刚度组装 (2026-10-05T08:47:43Z) → 方程求解 (2026-10-05T08:47:43Z) → 结果恢复 (2026-10-05T08:47:43Z)。</w:t>
+        <w:t xml:space="preserve">运行来源 formal-model；请求 request_994f567a-5a1b-4ab3-bcf4-a29f96d2e5d7；实际阶段 模型检查 (2026-10-05T09:05:18Z) → 刚度组装 (2026-10-05T09:05:18Z) → 方程求解 (2026-10-05T09:05:18Z) → 结果恢复 (2026-10-05T09:05:18Z)。</w:t>
       </w:r>
     </w:p>
     <w:p>
@@ -6371,7 +6371,7 @@
         <w:spacing w:after="130"/>
       </w:pPr>
       <w:r>
-        <w:t xml:space="preserve">正文来源分析 analysis_3d5541c3-1998-4796-b283-9192a884ea55；输入修订 R12；CB1 · Independent combination · 用户定义组合。</w:t>
+        <w:t xml:space="preserve">正文来源分析 analysis_719768b7-baec-471c-ab94-7d9f31dc3c98；输入修订 R12；CB1 · Independent combination · 用户定义组合。</w:t>
       </w:r>
     </w:p>
     <w:p>
@@ -6413,7 +6413,7 @@
         <w:spacing w:after="130"/>
       </w:pPr>
       <w:r>
-        <w:t xml:space="preserve">按冻结输入重建 · 分析 analysis_3d5541c3-1998-4796-b283-9192a884ea55；位移与杆端力来自该分析的已保存结果。</w:t>
+        <w:t xml:space="preserve">按冻结输入重建 · 分析 analysis_719768b7-baec-471c-ab94-7d9f31dc3c98；位移与杆端力来自该分析的已保存结果。</w:t>
       </w:r>
     </w:p>
     <w:p>
@@ -24995,7 +24995,7 @@
         <w:spacing w:after="130"/>
       </w:pPr>
       <w:r>
-        <w:t xml:space="preserve">本次运行实际快照 · 分析 analysis_3d5541c3-1998-4796-b283-9192a884ea55</w:t>
+        <w:t xml:space="preserve">本次运行实际快照 · 分析 analysis_719768b7-baec-471c-ab94-7d9f31dc3c98</w:t>
       </w:r>
     </w:p>
     <w:p>

</xml_diff>